<commit_message>
Update FEDL experiments for Sayyad Faizan (25DCO11)
- Update name to Sayyad Faizan and roll number to 25DCO11 across all 11 FEDL experiment Word documents.
- Replace Mac browser output screenshots with Windows Chrome output screenshots.
- Apply document formatting enhancements to headings, tables, and spacing.

Co-authored-by: SayyadFaizan <141846057+SayyadFaizan@users.noreply.github.com>
</commit_message>
<xml_diff>
--- a/FEDL/EXP-3.docx
+++ b/FEDL/EXP-3.docx
@@ -718,7 +718,7 @@
           <w:szCs w:val="20"/>
           <w:rtl w:val="0"/>
         </w:rPr>
-        <w:t xml:space="preserve">                    &lt;a class="navbar-brand" href="#"&gt;Mukhtar Ansari&lt;/a&gt;</w:t>
+        <w:t xml:space="preserve">                    &lt;a class="navbar-brand" href="#"&gt;Sayyad Faizan&lt;/a&gt;</w:t>
       </w:r>
       <w:r>
         <w:rPr>
@@ -1437,7 +1437,7 @@
           <w:szCs w:val="20"/>
           <w:rtl w:val="0"/>
         </w:rPr>
-        <w:t xml:space="preserve">            &lt;h1&gt;Welcome to Mukhtar's Website&lt;/h1&gt;</w:t>
+        <w:t xml:space="preserve">            &lt;h1&gt;Welcome to Sayyad's Website&lt;/h1&gt;</w:t>
       </w:r>
       <w:r>
         <w:rPr>
@@ -3311,7 +3311,7 @@
           <w:szCs w:val="20"/>
           <w:rtl w:val="0"/>
         </w:rPr>
-        <w:t xml:space="preserve">                    &lt;a class="text-reset fw-bold" href="#"&gt;mukhtarerp.com&lt;/a&gt;</w:t>
+        <w:t xml:space="preserve">                    &lt;a class="text-reset fw-bold" href="#"&gt;sayyaderp.com&lt;/a&gt;</w:t>
       </w:r>
       <w:r>
         <w:rPr>

</xml_diff>